<commit_message>
Document separate server and client startup
</commit_message>
<xml_diff>
--- a/readme.docx
+++ b/readme.docx
@@ -407,7 +407,62 @@
     </w:p>
     <w:p>
       <w:r>
-        <w:t>The health endpoint is /api/health under the deployed context. The source repository is listed in the submitter table above and linked at the end of this guide.</w:t>
+        <w:t>The health endpoint is /api/health under the deployed context.</w:t>
+      </w:r>
+    </w:p>
+    <w:p>
+      <w:pPr>
+        <w:pStyle w:val="Heading2"/>
+      </w:pPr>
+      <w:r>
+        <w:t>Run from the source repository</w:t>
+      </w:r>
+    </w:p>
+    <w:p>
+      <w:r>
+        <w:t>On macOS or Linux, install JDK 25 or newer and run these commands from the repository root. If the client has not been built, run ./build.sh before ./run.sh:</w:t>
+      </w:r>
+    </w:p>
+    <w:p>
+      <w:pPr>
+        <w:spacing w:after="160"/>
+      </w:pPr>
+      <w:r>
+        <w:rPr>
+          <w:rFonts w:ascii="Courier New" w:hAnsi="Courier New"/>
+          <w:sz w:val="18"/>
+        </w:rPr>
+        <w:t>./start-guess-market.sh     # start the server</w:t>
+      </w:r>
+      <w:r>
+        <w:br/>
+      </w:r>
+      <w:r>
+        <w:rPr>
+          <w:rFonts w:ascii="Courier New" w:hAnsi="Courier New"/>
+          <w:sz w:val="18"/>
+        </w:rPr>
+        <w:t>./run.sh                   # launch a client separately</w:t>
+      </w:r>
+      <w:r>
+        <w:br/>
+      </w:r>
+      <w:r>
+        <w:rPr>
+          <w:rFonts w:ascii="Courier New" w:hAnsi="Courier New"/>
+          <w:sz w:val="18"/>
+        </w:rPr>
+        <w:t>./start-guess-market.sh --stop</w:t>
+      </w:r>
+    </w:p>
+    <w:p>
+      <w:r>
+        <w:t>The launcher builds and starts only the server. On first use it downloads Tomcat 10.1.59, unless CATALINA_HOME points to an existing Tomcat 10.1 installation. Downloads and local server files stay in .runtime. Its server-only build preserves existing client outputs.</w:t>
+      </w:r>
+    </w:p>
+    <w:p>
+      <w:r>
+        <w:t>Use --port 8081 to choose another port and update the client Server field to match. Use --no-build to start the existing WAR. Stop the local server before rebuilding or changing its port.</w:t>
       </w:r>
     </w:p>
     <w:p>

</xml_diff>

<commit_message>
Improve state transfer and event details
</commit_message>
<xml_diff>
--- a/readme.docx
+++ b/readme.docx
@@ -516,7 +516,7 @@
     </w:p>
     <w:p>
       <w:r>
-        <w:t>Other users are represented by username, balance and market-maker status only. Private account rows and personal involvement records always belong to the logged-in user. The header keeps your current balance visible on every tab and provides Upload events, Load funds, a skin selector and Sign out. Midnight, Daylight and Neon reuse the earlier design.</w:t>
+        <w:t>Other users are represented by username, balance and market-maker status only. Private account rows and personal involvement records always belong to the logged-in user. The header keeps the current balance visible and provides Upload events, Save state and Restore state. Midnight, Daylight and Neon reuse the earlier design.</w:t>
       </w:r>
     </w:p>
     <w:p>
@@ -542,6 +542,29 @@
         <w:pStyle w:val="Heading2"/>
       </w:pPr>
       <w:r>
+        <w:t>Save and restore Exercise 3 state</w:t>
+      </w:r>
+    </w:p>
+    <w:p>
+      <w:r>
+        <w:t>Save state downloads a versioned .gmstate snapshot from the server. This file is separate from the Exercise 3 XML schema: XML uploads still contain only event definitions, with no GM-users element and no event id. The state snapshot stores the generated IDs and the running market model, including registered users, balances, blocking status, holdings, open orders, trades, settlements, price histories and account histories.</w:t>
+      </w:r>
+    </w:p>
+    <w:p>
+      <w:r>
+        <w:t>Restore state accepts only a .gmstate file exported by the Exercise 3 server, up to 16 MB, and atomically replaces the shared market for every client. The uploader's current username must exist in the file. Connected users present in the restored state keep their sessions; an absent user is signed out on the next request. After a restart, restored user names may each be claimed once by a client.</w:t>
+      </w:r>
+    </w:p>
+    <w:p>
+      <w:r>
+        <w:t>Chat and HTTP sessions are intentionally not serialized. Restoring state clears the transient chat. A rejected, damaged, oversized or wrong-version file leaves the current market untouched, and an allowlist restricts the classes accepted during deserialization. Uploaded XML and state bytes remain in memory and are never written to the server filesystem.</w:t>
+      </w:r>
+    </w:p>
+    <w:p>
+      <w:pPr>
+        <w:pStyle w:val="Heading2"/>
+      </w:pPr>
+      <w:r>
         <w:t>Live updates and chat</w:t>
       </w:r>
     </w:p>
@@ -553,11 +576,6 @@
     <w:p>
       <w:r>
         <w:t>Layouts wrap controls, provide scrolling and rearrange their split panes vertically in narrower windows. Window resizing leaves both the event and private account details accessible.</w:t>
-      </w:r>
-    </w:p>
-    <w:p>
-      <w:r>
-        <w:br w:type="page"/>
       </w:r>
     </w:p>
     <w:p>
@@ -1095,15 +1113,8 @@
             </w:tcMar>
           </w:tcPr>
           <w:p>
-            <w:pPr>
-              <w:spacing w:after="0" w:line="245" w:lineRule="auto"/>
-            </w:pPr>
             <w:r>
-              <w:rPr>
-                <w:b w:val="0"/>
-                <w:sz w:val="19"/>
-              </w:rPr>
-              <w:t>Owns the online engine, session authentication and shared chat. It holds the engine monitor while applying actions or collecting a complete snapshot.</w:t>
+              <w:t>Owns the online engine, session authentication, claimed usernames and shared chat. It holds the engine monitor while applying actions, restoring state or collecting a complete snapshot.</w:t>
             </w:r>
           </w:p>
         </w:tc>
@@ -1148,15 +1159,8 @@
             </w:tcMar>
           </w:tcPr>
           <w:p>
-            <w:pPr>
-              <w:spacing w:after="0" w:line="245" w:lineRule="auto"/>
-            </w:pPr>
             <w:r>
-              <w:rPr>
-                <w:b w:val="0"/>
-                <w:sz w:val="19"/>
-              </w:rPr>
-              <w:t>Routes /api/* requests, binds identity from the session, translates commands to engine DTOs, maps failures to JSON and handles uploads entirely in memory.</w:t>
+              <w:t>Routes /api/* requests, binds identity from the session, translates commands to engine DTOs, maps failures to JSON and transfers XML and state files entirely in memory.</w:t>
             </w:r>
           </w:p>
         </w:tc>
@@ -1396,15 +1400,8 @@
             </w:tcMar>
           </w:tcPr>
           <w:p>
-            <w:pPr>
-              <w:spacing w:after="0" w:line="245" w:lineRule="auto"/>
-            </w:pPr>
             <w:r>
-              <w:rPr>
-                <w:b w:val="0"/>
-                <w:sz w:val="19"/>
-              </w:rPr>
-              <w:t>Extends GuessMarketEngine with registration, deposits, stream uploads and account history.</w:t>
+              <w:t>Extends GuessMarketEngine with registration, deposits, event uploads, account history and Exercise 3 state import and export.</w:t>
             </w:r>
           </w:p>
         </w:tc>
@@ -1449,15 +1446,8 @@
             </w:tcMar>
           </w:tcPr>
           <w:p>
-            <w:pPr>
-              <w:spacing w:after="0" w:line="245" w:lineRule="auto"/>
-            </w:pPr>
             <w:r>
-              <w:rPr>
-                <w:b w:val="0"/>
-                <w:sz w:val="19"/>
-              </w:rPr>
-              <w:t>Starts with an empty market, adds users and files cumulatively, exposes ledger rows, and disables offline replacement and persistence methods.</w:t>
+              <w:t>Starts with an empty market, adds users and XML files cumulatively, and exports or atomically replaces the complete online model through a versioned state stream.</w:t>
             </w:r>
           </w:p>
         </w:tc>
@@ -1573,11 +1563,6 @@
       <w:pPr>
         <w:spacing w:after="0"/>
       </w:pPr>
-    </w:p>
-    <w:p>
-      <w:r>
-        <w:br w:type="page"/>
-      </w:r>
     </w:p>
     <w:p>
       <w:pPr>
@@ -1763,15 +1748,8 @@
             </w:tcMar>
           </w:tcPr>
           <w:p>
-            <w:pPr>
-              <w:spacing w:after="0" w:line="245" w:lineRule="auto"/>
-            </w:pPr>
             <w:r>
-              <w:rPr>
-                <w:b w:val="0"/>
-                <w:sz w:val="20"/>
-              </w:rPr>
-              <w:t>Builds the login screen, Events, My account and Chat; applies snapshots; preserves selections; manages skins, upload and funding controls.</w:t>
+              <w:t>Builds the login screen, Events, My account and Chat; applies snapshots; preserves selections; and manages themes, event uploads, state save and restore, and funding controls.</w:t>
             </w:r>
           </w:p>
         </w:tc>
@@ -1869,15 +1847,8 @@
             </w:tcMar>
           </w:tcPr>
           <w:p>
-            <w:pPr>
-              <w:spacing w:after="0" w:line="245" w:lineRule="auto"/>
-            </w:pPr>
             <w:r>
-              <w:rPr>
-                <w:b w:val="0"/>
-                <w:sz w:val="20"/>
-              </w:rPr>
-              <w:t>Uses JDK HttpClient, a cookie store and Gson for HTTP/JSON. It resolves the server URL, posts multipart bytes, enforces timeouts and reads structured errors.</w:t>
+              <w:t>Uses JDK HttpClient, a cookie store and Gson for HTTP/JSON and binary state downloads. It resolves the server URL, posts multipart bytes, enforces timeouts and reads structured errors.</w:t>
             </w:r>
           </w:p>
         </w:tc>
@@ -2250,6 +2221,28 @@
         </w:tc>
       </w:tr>
       <w:tr>
+        <w:tc>
+          <w:tcPr>
+            <w:tcW w:type="dxa" w:w="2520"/>
+          </w:tcPr>
+          <w:p>
+            <w:r>
+              <w:t>StateTransferResultDto</w:t>
+            </w:r>
+          </w:p>
+        </w:tc>
+        <w:tc>
+          <w:tcPr>
+            <w:tcW w:type="dxa" w:w="7315"/>
+          </w:tcPr>
+          <w:p>
+            <w:r>
+              <w:t>Imported state filename and the restored event and registered-user totals.</w:t>
+            </w:r>
+          </w:p>
+        </w:tc>
+      </w:tr>
+      <w:tr>
         <w:trPr>
           <w:cantSplit/>
         </w:trPr>
@@ -2473,11 +2466,6 @@
       </w:r>
     </w:p>
     <w:p>
-      <w:r>
-        <w:br w:type="page"/>
-      </w:r>
-    </w:p>
-    <w:p>
       <w:pPr>
         <w:pStyle w:val="Heading1"/>
       </w:pPr>
@@ -2487,7 +2475,7 @@
     </w:p>
     <w:p>
       <w:r>
-        <w:t>All paths below are relative to http://localhost:8080/guess-market/api/. JSON requests use Content-Type: application/json; the upload uses multipart/form-data. Event option indexes start at zero. The server uses a cookie-backed HTTP session, with HttpOnly and SameSite=Lax cookie settings.</w:t>
+        <w:t>All paths below are relative to http://localhost:8080/guess-market/api/. JSON requests use Content-Type: application/json; XML and state uploads use multipart/form-data. Event option indexes start at zero. The server uses a cookie-backed HTTP session, with HttpOnly and SameSite=Lax cookie settings.</w:t>
       </w:r>
     </w:p>
     <w:tbl>
@@ -2658,15 +2646,8 @@
             </w:tcMar>
           </w:tcPr>
           <w:p>
-            <w:pPr>
-              <w:spacing w:after="0" w:line="245" w:lineRule="auto"/>
-            </w:pPr>
             <w:r>
-              <w:rPr>
-                <w:b w:val="0"/>
-                <w:sz w:val="18"/>
-              </w:rPr>
-              <w:t>{username} creates a session and returns LoginResponseDto. An existing name returns HTTP 409.</w:t>
+              <w:t>{username} creates a session and returns LoginResponseDto. An already claimed name returns HTTP 409.</w:t>
             </w:r>
           </w:p>
         </w:tc>
@@ -2879,6 +2860,50 @@
                 <w:sz w:val="18"/>
               </w:rPr>
               <w:t>One multipart field named file, containing one XML file. Returns LoadResultDto.</w:t>
+            </w:r>
+          </w:p>
+        </w:tc>
+      </w:tr>
+      <w:tr>
+        <w:tc>
+          <w:tcPr>
+            <w:tcW w:type="dxa" w:w="2376"/>
+          </w:tcPr>
+          <w:p>
+            <w:r>
+              <w:t>GET /state</w:t>
+            </w:r>
+          </w:p>
+        </w:tc>
+        <w:tc>
+          <w:tcPr>
+            <w:tcW w:type="dxa" w:w="7459"/>
+          </w:tcPr>
+          <w:p>
+            <w:r>
+              <w:t>Downloads the complete versioned Exercise 3 state as guess-market.gmstate.</w:t>
+            </w:r>
+          </w:p>
+        </w:tc>
+      </w:tr>
+      <w:tr>
+        <w:tc>
+          <w:tcPr>
+            <w:tcW w:type="dxa" w:w="2376"/>
+          </w:tcPr>
+          <w:p>
+            <w:r>
+              <w:t>POST /state</w:t>
+            </w:r>
+          </w:p>
+        </w:tc>
+        <w:tc>
+          <w:tcPr>
+            <w:tcW w:type="dxa" w:w="7459"/>
+          </w:tcPr>
+          <w:p>
+            <w:r>
+              <w:t>One multipart field named file containing one Exercise 3 .gmstate file. Returns StateTransferResultDto.</w:t>
             </w:r>
           </w:p>
         </w:tc>
@@ -3288,12 +3313,7 @@
     </w:p>
     <w:p>
       <w:r>
-        <w:t>All engine calls are synchronized. The service also holds that same monitor while collecting an entire snapshot, so another request cannot expose a half-completed trade, commission payment or settlement. Upload validation and insertion are atomic. A slow request delays the next poll instead of creating overlapping pulls.</w:t>
-      </w:r>
-    </w:p>
-    <w:p>
-      <w:r>
-        <w:br w:type="page"/>
+        <w:t>All engine calls are synchronized. The service also holds that same monitor while collecting an entire snapshot, so another request cannot expose a half-completed trade, commission payment or settlement. Upload validation, event insertion and complete state replacement are atomic. A slow request delays the next poll instead of creating overlapping pulls.</w:t>
       </w:r>
     </w:p>
     <w:p>
@@ -3395,6 +3415,14 @@
     <w:p>
       <w:pPr>
         <w:pStyle w:val="ListBullet"/>
+      </w:pPr>
+      <w:r>
+        <w:t>Save the state after trading, make another deposit or event, then restore the saved file. Confirm that generated event IDs, every user's balance, ledger, holdings, orders and trade history return to their saved values in both clients.</w:t>
+      </w:r>
+    </w:p>
+    <w:p>
+      <w:pPr>
+        <w:pStyle w:val="ListBullet"/>
         <w:spacing w:after="100"/>
       </w:pPr>
       <w:r>
@@ -3425,12 +3453,12 @@
     </w:p>
     <w:p>
       <w:r>
-        <w:t>Usernames are case-insensitive and remain reserved for the server lifetime, including after logout, client closure or session expiry. This prevents a fresh session from claiming an existing account without a password. Keep the same client window open to retain access. Sessions expire after 30 minutes without requests; active polling keeps them alive.</w:t>
+        <w:t>Usernames are case-insensitive and remain reserved after they are claimed, including after logout, client closure or session expiry. A user restored after a restart can be claimed once by a client; this lets independent clients continue restored accounts without adding users to the Exercise 3 XML schema. Sessions expire after 30 minutes without requests; active polling keeps them alive.</w:t>
       </w:r>
     </w:p>
     <w:p>
       <w:r>
-        <w:t>Events, accounts, history, chat and sessions exist only in memory and disappear when the application or server stops. Tomcat session persistence is explicitly disabled. XML upload bytes remain in memory through native Servlet multipart handling; no uploaded content is saved to a server file.</w:t>
+        <w:t>The live server keeps events, accounts, history, chat and sessions in memory, and Tomcat session persistence is disabled. A client can explicitly download the market model to an Exercise 3 .gmstate file and restore it after a restart. Chat and sessions remain transient and are not serialized. XML and state upload bytes stay in memory; no uploaded content is written to a server file.</w:t>
       </w:r>
     </w:p>
     <w:p>

</xml_diff>